<commit_message>
Add HTML CSS JavaScript Supabase version
</commit_message>
<xml_diff>
--- a/barbershop_project/docs/Project_Progress_Report.docx
+++ b/barbershop_project/docs/Project_Progress_Report.docx
@@ -3,239 +3,27 @@
 <w:document xmlns:wpc="http://schemas.microsoft.com/office/word/2010/wordprocessingCanvas" xmlns:mo="http://schemas.microsoft.com/office/mac/office/2008/main" xmlns:mc="http://schemas.openxmlformats.org/markup-compatibility/2006" xmlns:mv="urn:schemas-microsoft-com:mac:vml" xmlns:o="urn:schemas-microsoft-com:office:office" xmlns:r="http://schemas.openxmlformats.org/officeDocument/2006/relationships" xmlns:m="http://schemas.openxmlformats.org/officeDocument/2006/math" xmlns:v="urn:schemas-microsoft-com:vml" xmlns:wp14="http://schemas.microsoft.com/office/word/2010/wordprocessingDrawing" xmlns:wp="http://schemas.openxmlformats.org/drawingml/2006/wordprocessingDrawing" xmlns:w10="urn:schemas-microsoft-com:office:word" xmlns:w="http://schemas.openxmlformats.org/wordprocessingml/2006/main" xmlns:w14="http://schemas.microsoft.com/office/word/2010/wordml" xmlns:wpg="http://schemas.microsoft.com/office/word/2010/wordprocessingGroup" xmlns:wpi="http://schemas.microsoft.com/office/word/2010/wordprocessingInk" xmlns:wne="http://schemas.microsoft.com/office/word/2006/wordml" xmlns:wps="http://schemas.microsoft.com/office/word/2010/wordprocessingShape" mc:Ignorable="w14 wp14">
   <w:body>
     <w:p>
-      <w:r>
-        <w:rPr>
-          <w:i w:val="0"/>
-        </w:rPr>
-      </w:r>
-    </w:p>
-    <w:p>
-      <w:r>
-        <w:rPr>
-          <w:i w:val="0"/>
-        </w:rPr>
-      </w:r>
-    </w:p>
-    <w:p>
       <w:pPr>
-        <w:spacing w:after="160"/>
+        <w:spacing w:before="500"/>
       </w:pPr>
       <w:r>
         <w:rPr>
-          <w:rFonts w:ascii="Arial" w:hAnsi="Arial"/>
           <w:b/>
-          <w:color w:val="214F3C"/>
-          <w:sz w:val="56"/>
         </w:rPr>
-        <w:t>B.</w:t>
-      </w:r>
-    </w:p>
-    <w:p>
-      <w:pPr>
-        <w:spacing w:before="160" w:after="200"/>
-      </w:pPr>
-      <w:r>
-        <w:rPr>
-          <w:rFonts w:ascii="Arial" w:hAnsi="Arial"/>
-          <w:b/>
-          <w:color w:val="214F3C"/>
-          <w:sz w:val="60"/>
-        </w:rPr>
-        <w:t>Project Progress Report</w:t>
-      </w:r>
-    </w:p>
-    <w:p>
-      <w:pPr>
-        <w:spacing w:after="480"/>
-      </w:pPr>
-      <w:r>
-        <w:rPr>
-          <w:color w:val="627067"/>
-          <w:sz w:val="28"/>
-        </w:rPr>
-        <w:t>Group status, current challenges, next steps and individual contribution</w:t>
-      </w:r>
-    </w:p>
-    <w:tbl>
-      <w:tblPr>
-        <w:tblW w:type="auto" w:w="0"/>
-        <w:jc w:val="left"/>
-        <w:tblLook w:firstColumn="1" w:firstRow="1" w:lastColumn="0" w:lastRow="0" w:noHBand="0" w:noVBand="1" w:val="04A0"/>
-      </w:tblPr>
-      <w:tblGrid>
-        <w:gridCol w:w="10166"/>
-      </w:tblGrid>
-      <w:tr>
-        <w:tc>
-          <w:tcPr>
-            <w:tcW w:type="dxa" w:w="10166"/>
-            <w:tcMar>
-              <w:top w:w="80" w:type="dxa"/>
-              <w:start w:w="0" w:type="dxa"/>
-              <w:bottom w:w="80" w:type="dxa"/>
-              <w:end w:w="0" w:type="dxa"/>
-            </w:tcMar>
-            <w:tcBorders>
-              <w:bottom w:val="single" w:sz="8" w:color="DFE5DC"/>
-            </w:tcBorders>
-          </w:tcPr>
-          <w:p>
-            <w:r>
-              <w:rPr>
-                <w:color w:val="627067"/>
-                <w:sz w:val="20"/>
-              </w:rPr>
-              <w:t>Project: Barbershop Booking Management System</w:t>
-            </w:r>
-          </w:p>
-        </w:tc>
-      </w:tr>
-      <w:tr>
-        <w:tc>
-          <w:tcPr>
-            <w:tcW w:type="dxa" w:w="10166"/>
-            <w:tcMar>
-              <w:top w:w="80" w:type="dxa"/>
-              <w:start w:w="0" w:type="dxa"/>
-              <w:bottom w:w="80" w:type="dxa"/>
-              <w:end w:w="0" w:type="dxa"/>
-            </w:tcMar>
-            <w:tcBorders>
-              <w:bottom w:val="single" w:sz="8" w:color="DFE5DC"/>
-            </w:tcBorders>
-          </w:tcPr>
-          <w:p>
-            <w:r>
-              <w:rPr>
-                <w:color w:val="627067"/>
-                <w:sz w:val="20"/>
-              </w:rPr>
-              <w:t>Report status: Editable working draft — update to match the group’s actual state</w:t>
-            </w:r>
-          </w:p>
-        </w:tc>
-      </w:tr>
-      <w:tr>
-        <w:tc>
-          <w:tcPr>
-            <w:tcW w:type="dxa" w:w="10166"/>
-            <w:tcMar>
-              <w:top w:w="80" w:type="dxa"/>
-              <w:start w:w="0" w:type="dxa"/>
-              <w:bottom w:w="80" w:type="dxa"/>
-              <w:end w:w="0" w:type="dxa"/>
-            </w:tcMar>
-            <w:tcBorders>
-              <w:bottom w:val="single" w:sz="8" w:color="DFE5DC"/>
-            </w:tcBorders>
-          </w:tcPr>
-          <w:p>
-            <w:r>
-              <w:rPr>
-                <w:color w:val="627067"/>
-                <w:sz w:val="20"/>
-              </w:rPr>
-              <w:t>Prepared: 20 October 2026</w:t>
-            </w:r>
-          </w:p>
-        </w:tc>
-      </w:tr>
-      <w:tr>
-        <w:tc>
-          <w:tcPr>
-            <w:tcW w:type="dxa" w:w="10166"/>
-            <w:tcMar>
-              <w:top w:w="80" w:type="dxa"/>
-              <w:start w:w="0" w:type="dxa"/>
-              <w:bottom w:w="80" w:type="dxa"/>
-              <w:end w:w="0" w:type="dxa"/>
-            </w:tcMar>
-            <w:tcBorders>
-              <w:bottom w:val="single" w:sz="8" w:color="DFE5DC"/>
-            </w:tcBorders>
-          </w:tcPr>
-          <w:p>
-            <w:r>
-              <w:rPr>
-                <w:color w:val="627067"/>
-                <w:sz w:val="20"/>
-              </w:rPr>
-              <w:t>Evidence included: local prototype, flowcharts, schema, smoke-test record, documentation and slides</w:t>
-            </w:r>
-          </w:p>
-        </w:tc>
-      </w:tr>
-    </w:tbl>
-    <w:p>
-      <w:r>
-        <w:rPr>
-          <w:i w:val="0"/>
-        </w:rPr>
-      </w:r>
-    </w:p>
-    <w:tbl>
-      <w:tblPr>
-        <w:tblW w:type="auto" w:w="0"/>
-        <w:jc w:val="center"/>
-        <w:tblLook w:firstColumn="1" w:firstRow="1" w:lastColumn="0" w:lastRow="0" w:noHBand="0" w:noVBand="1" w:val="04A0"/>
-      </w:tblPr>
-      <w:tblGrid>
-        <w:gridCol w:w="10166"/>
-      </w:tblGrid>
-      <w:tr>
-        <w:tc>
-          <w:tcPr>
-            <w:tcW w:type="dxa" w:w="10166"/>
-            <w:shd w:fill="FFF0C2"/>
-            <w:tcMar>
-              <w:top w:w="140" w:type="dxa"/>
-              <w:start w:w="180" w:type="dxa"/>
-              <w:bottom w:w="140" w:type="dxa"/>
-              <w:end w:w="180" w:type="dxa"/>
-            </w:tcMar>
-          </w:tcPr>
-          <w:p>
-            <w:pPr>
-              <w:spacing w:after="80"/>
-            </w:pPr>
-            <w:r>
-              <w:rPr>
-                <w:b/>
-                <w:color w:val="214F3C"/>
-              </w:rPr>
-              <w:t>Document status</w:t>
-            </w:r>
-          </w:p>
-          <w:p>
-            <w:pPr>
-              <w:spacing w:after="0" w:line="252" w:lineRule="auto"/>
-            </w:pPr>
-            <w:r>
-              <w:t>Working draft prepared from the current design and local prototype. Review the assumptions with the group and instructor before submission.</w:t>
-            </w:r>
-          </w:p>
-        </w:tc>
-      </w:tr>
-    </w:tbl>
-    <w:p>
-      <w:r>
-        <w:rPr>
-          <w:i w:val="0"/>
-        </w:rPr>
-      </w:r>
-    </w:p>
-    <w:p>
-      <w:r>
-        <w:br w:type="page"/>
+        <w:t>PART B — GROUP PROJECT PROGRESS</w:t>
       </w:r>
     </w:p>
     <w:p>
       <w:pPr>
         <w:pStyle w:val="Heading1"/>
-        <w:keepNext/>
       </w:pPr>
       <w:r>
-        <w:t>Part B — Group project progress</w:t>
+        <w:t>Project status snapshot</w:t>
+      </w:r>
+    </w:p>
+    <w:p>
+      <w:r>
+        <w:t>This draft reflects the files and work prepared for the HTML/CSS/JavaScript + Supabase version. Please revise the status based on what your group has actually pushed, configured, and tested. Do not mark the live database or deployment as complete until you have verified it yourselves.</w:t>
       </w:r>
     </w:p>
     <w:tbl>
@@ -247,19 +35,18 @@
         <w:tblLook w:firstColumn="1" w:firstRow="1" w:lastColumn="0" w:lastRow="0" w:noHBand="0" w:noVBand="1" w:val="04A0"/>
       </w:tblPr>
       <w:tblGrid>
-        <w:gridCol w:w="3389"/>
-        <w:gridCol w:w="3389"/>
-        <w:gridCol w:w="3389"/>
+        <w:gridCol w:w="2232"/>
+        <w:gridCol w:w="1584"/>
+        <w:gridCol w:w="5400"/>
       </w:tblGrid>
       <w:tr>
         <w:trPr>
           <w:tblHeader w:val="true"/>
-          <w:cantSplit/>
         </w:trPr>
         <w:tc>
           <w:tcPr>
-            <w:tcW w:type="dxa" w:w="2160"/>
-            <w:shd w:fill="214F3C"/>
+            <w:tcW w:type="dxa" w:w="3408"/>
+            <w:shd w:fill="50634F"/>
             <w:vAlign w:val="center"/>
             <w:tcMar>
               <w:top w:w="90" w:type="dxa"/>
@@ -274,19 +61,19 @@
             </w:pPr>
             <w:r>
               <w:rPr>
-                <w:rFonts w:ascii="Arial" w:hAnsi="Arial"/>
+                <w:rFonts w:ascii="Aptos" w:hAnsi="Aptos"/>
                 <w:b/>
                 <w:color w:val="FFFFFF"/>
                 <w:sz w:val="14"/>
               </w:rPr>
-              <w:t>Project component</w:t>
+              <w:t>Project Component</w:t>
             </w:r>
           </w:p>
         </w:tc>
         <w:tc>
           <w:tcPr>
-            <w:tcW w:type="dxa" w:w="1800"/>
-            <w:shd w:fill="214F3C"/>
+            <w:tcW w:type="dxa" w:w="3408"/>
+            <w:shd w:fill="50634F"/>
             <w:vAlign w:val="center"/>
             <w:tcMar>
               <w:top w:w="90" w:type="dxa"/>
@@ -301,7 +88,7 @@
             </w:pPr>
             <w:r>
               <w:rPr>
-                <w:rFonts w:ascii="Arial" w:hAnsi="Arial"/>
+                <w:rFonts w:ascii="Aptos" w:hAnsi="Aptos"/>
                 <w:b/>
                 <w:color w:val="FFFFFF"/>
                 <w:sz w:val="14"/>
@@ -312,8 +99,8 @@
         </w:tc>
         <w:tc>
           <w:tcPr>
-            <w:tcW w:type="dxa" w:w="5832"/>
-            <w:shd w:fill="214F3C"/>
+            <w:tcW w:type="dxa" w:w="3408"/>
+            <w:shd w:fill="50634F"/>
             <w:vAlign w:val="center"/>
             <w:tcMar>
               <w:top w:w="90" w:type="dxa"/>
@@ -328,7 +115,7 @@
             </w:pPr>
             <w:r>
               <w:rPr>
-                <w:rFonts w:ascii="Arial" w:hAnsi="Arial"/>
+                <w:rFonts w:ascii="Aptos" w:hAnsi="Aptos"/>
                 <w:b/>
                 <w:color w:val="FFFFFF"/>
                 <w:sz w:val="14"/>
@@ -339,13 +126,10 @@
         </w:tc>
       </w:tr>
       <w:tr>
-        <w:trPr>
-          <w:cantSplit/>
-        </w:trPr>
         <w:tc>
           <w:tcPr>
-            <w:tcW w:type="dxa" w:w="2160"/>
-            <w:vAlign w:val="top"/>
+            <w:tcW w:type="dxa" w:w="2232"/>
+            <w:vAlign w:val="center"/>
             <w:tcMar>
               <w:top w:w="90" w:type="dxa"/>
               <w:start w:w="100" w:type="dxa"/>
@@ -359,8 +143,8 @@
             </w:pPr>
             <w:r>
               <w:rPr>
-                <w:rFonts w:ascii="Arial" w:hAnsi="Arial"/>
-                <w:color w:val="17251F"/>
+                <w:rFonts w:ascii="Aptos" w:hAnsi="Aptos"/>
+                <w:color w:val="1F2B22"/>
                 <w:sz w:val="14"/>
               </w:rPr>
               <w:t>Problem / Project Definition</w:t>
@@ -369,8 +153,8 @@
         </w:tc>
         <w:tc>
           <w:tcPr>
-            <w:tcW w:type="dxa" w:w="1800"/>
-            <w:vAlign w:val="top"/>
+            <w:tcW w:type="dxa" w:w="1584"/>
+            <w:vAlign w:val="center"/>
             <w:tcMar>
               <w:top w:w="90" w:type="dxa"/>
               <w:start w:w="100" w:type="dxa"/>
@@ -384,18 +168,18 @@
             </w:pPr>
             <w:r>
               <w:rPr>
-                <w:rFonts w:ascii="Arial" w:hAnsi="Arial"/>
-                <w:color w:val="17251F"/>
+                <w:rFonts w:ascii="Aptos" w:hAnsi="Aptos"/>
+                <w:color w:val="1F2B22"/>
                 <w:sz w:val="14"/>
               </w:rPr>
-              <w:t>Completed</w:t>
+              <w:t>In Progress</w:t>
             </w:r>
           </w:p>
         </w:tc>
         <w:tc>
           <w:tcPr>
-            <w:tcW w:type="dxa" w:w="5832"/>
-            <w:vAlign w:val="top"/>
+            <w:tcW w:type="dxa" w:w="5400"/>
+            <w:vAlign w:val="center"/>
             <w:tcMar>
               <w:top w:w="90" w:type="dxa"/>
               <w:start w:w="100" w:type="dxa"/>
@@ -409,30 +193,27 @@
             </w:pPr>
             <w:r>
               <w:rPr>
-                <w:rFonts w:ascii="Arial" w:hAnsi="Arial"/>
-                <w:color w:val="17251F"/>
+                <w:rFonts w:ascii="Aptos" w:hAnsi="Aptos"/>
+                <w:color w:val="1F2B22"/>
                 <w:sz w:val="14"/>
               </w:rPr>
-              <w:t>The problem of long queues, uncertain waiting times and manual appointment handling is defined.</w:t>
+              <w:t>The problem and target users are defined. Any interview findings or statistics still need real evidence.</w:t>
             </w:r>
           </w:p>
         </w:tc>
       </w:tr>
       <w:tr>
-        <w:trPr>
-          <w:cantSplit/>
-        </w:trPr>
         <w:tc>
           <w:tcPr>
-            <w:tcW w:type="dxa" w:w="2160"/>
-            <w:vAlign w:val="top"/>
+            <w:tcW w:type="dxa" w:w="2232"/>
+            <w:vAlign w:val="center"/>
             <w:tcMar>
               <w:top w:w="90" w:type="dxa"/>
               <w:start w:w="100" w:type="dxa"/>
               <w:bottom w:w="90" w:type="dxa"/>
               <w:end w:w="100" w:type="dxa"/>
             </w:tcMar>
-            <w:shd w:fill="F2F5EF"/>
+            <w:shd w:fill="F7F6F1"/>
           </w:tcPr>
           <w:p>
             <w:pPr>
@@ -440,8 +221,8 @@
             </w:pPr>
             <w:r>
               <w:rPr>
-                <w:rFonts w:ascii="Arial" w:hAnsi="Arial"/>
-                <w:color w:val="17251F"/>
+                <w:rFonts w:ascii="Aptos" w:hAnsi="Aptos"/>
+                <w:color w:val="1F2B22"/>
                 <w:sz w:val="14"/>
               </w:rPr>
               <w:t>Requirements Gathering</w:t>
@@ -450,15 +231,15 @@
         </w:tc>
         <w:tc>
           <w:tcPr>
-            <w:tcW w:type="dxa" w:w="1800"/>
-            <w:vAlign w:val="top"/>
+            <w:tcW w:type="dxa" w:w="1584"/>
+            <w:vAlign w:val="center"/>
             <w:tcMar>
               <w:top w:w="90" w:type="dxa"/>
               <w:start w:w="100" w:type="dxa"/>
               <w:bottom w:w="90" w:type="dxa"/>
               <w:end w:w="100" w:type="dxa"/>
             </w:tcMar>
-            <w:shd w:fill="F2F5EF"/>
+            <w:shd w:fill="F7F6F1"/>
           </w:tcPr>
           <w:p>
             <w:pPr>
@@ -466,8 +247,8 @@
             </w:pPr>
             <w:r>
               <w:rPr>
-                <w:rFonts w:ascii="Arial" w:hAnsi="Arial"/>
-                <w:color w:val="17251F"/>
+                <w:rFonts w:ascii="Aptos" w:hAnsi="Aptos"/>
+                <w:color w:val="1F2B22"/>
                 <w:sz w:val="14"/>
               </w:rPr>
               <w:t>In Progress</w:t>
@@ -476,15 +257,15 @@
         </w:tc>
         <w:tc>
           <w:tcPr>
-            <w:tcW w:type="dxa" w:w="5832"/>
-            <w:vAlign w:val="top"/>
+            <w:tcW w:type="dxa" w:w="5400"/>
+            <w:vAlign w:val="center"/>
             <w:tcMar>
               <w:top w:w="90" w:type="dxa"/>
               <w:start w:w="100" w:type="dxa"/>
               <w:bottom w:w="90" w:type="dxa"/>
               <w:end w:w="100" w:type="dxa"/>
             </w:tcMar>
-            <w:shd w:fill="F2F5EF"/>
+            <w:shd w:fill="F7F6F1"/>
           </w:tcPr>
           <w:p>
             <w:pPr>
@@ -492,23 +273,20 @@
             </w:pPr>
             <w:r>
               <w:rPr>
-                <w:rFonts w:ascii="Arial" w:hAnsi="Arial"/>
-                <w:color w:val="17251F"/>
+                <w:rFonts w:ascii="Aptos" w:hAnsi="Aptos"/>
+                <w:color w:val="1F2B22"/>
                 <w:sz w:val="14"/>
               </w:rPr>
-              <w:t>Functional needs and role responsibilities are drafted; real stakeholder confirmation is still needed.</w:t>
+              <w:t>The user roles and main features are listed. Confirm them with the group and instructor.</w:t>
             </w:r>
           </w:p>
         </w:tc>
       </w:tr>
       <w:tr>
-        <w:trPr>
-          <w:cantSplit/>
-        </w:trPr>
         <w:tc>
           <w:tcPr>
-            <w:tcW w:type="dxa" w:w="2160"/>
-            <w:vAlign w:val="top"/>
+            <w:tcW w:type="dxa" w:w="2232"/>
+            <w:vAlign w:val="center"/>
             <w:tcMar>
               <w:top w:w="90" w:type="dxa"/>
               <w:start w:w="100" w:type="dxa"/>
@@ -522,8 +300,8 @@
             </w:pPr>
             <w:r>
               <w:rPr>
-                <w:rFonts w:ascii="Arial" w:hAnsi="Arial"/>
-                <w:color w:val="17251F"/>
+                <w:rFonts w:ascii="Aptos" w:hAnsi="Aptos"/>
+                <w:color w:val="1F2B22"/>
                 <w:sz w:val="14"/>
               </w:rPr>
               <w:t>Functional Requirements</w:t>
@@ -532,8 +310,8 @@
         </w:tc>
         <w:tc>
           <w:tcPr>
-            <w:tcW w:type="dxa" w:w="1800"/>
-            <w:vAlign w:val="top"/>
+            <w:tcW w:type="dxa" w:w="1584"/>
+            <w:vAlign w:val="center"/>
             <w:tcMar>
               <w:top w:w="90" w:type="dxa"/>
               <w:start w:w="100" w:type="dxa"/>
@@ -547,18 +325,18 @@
             </w:pPr>
             <w:r>
               <w:rPr>
-                <w:rFonts w:ascii="Arial" w:hAnsi="Arial"/>
-                <w:color w:val="17251F"/>
+                <w:rFonts w:ascii="Aptos" w:hAnsi="Aptos"/>
+                <w:color w:val="1F2B22"/>
                 <w:sz w:val="14"/>
               </w:rPr>
-              <w:t>Completed draft</w:t>
+              <w:t>Completed (Draft)</w:t>
             </w:r>
           </w:p>
         </w:tc>
         <w:tc>
           <w:tcPr>
-            <w:tcW w:type="dxa" w:w="5832"/>
-            <w:vAlign w:val="top"/>
+            <w:tcW w:type="dxa" w:w="5400"/>
+            <w:vAlign w:val="center"/>
             <w:tcMar>
               <w:top w:w="90" w:type="dxa"/>
               <w:start w:w="100" w:type="dxa"/>
@@ -572,30 +350,27 @@
             </w:pPr>
             <w:r>
               <w:rPr>
-                <w:rFonts w:ascii="Arial" w:hAnsi="Arial"/>
-                <w:color w:val="17251F"/>
+                <w:rFonts w:ascii="Aptos" w:hAnsi="Aptos"/>
+                <w:color w:val="1F2B22"/>
                 <w:sz w:val="14"/>
               </w:rPr>
-              <w:t>Customer booking, admin operations, barber schedule/earnings, owner reports and review moderation are documented.</w:t>
+              <w:t>Customer booking, admin scheduling, barber earnings, and owner controls are documented.</w:t>
             </w:r>
           </w:p>
         </w:tc>
       </w:tr>
       <w:tr>
-        <w:trPr>
-          <w:cantSplit/>
-        </w:trPr>
         <w:tc>
           <w:tcPr>
-            <w:tcW w:type="dxa" w:w="2160"/>
-            <w:vAlign w:val="top"/>
+            <w:tcW w:type="dxa" w:w="2232"/>
+            <w:vAlign w:val="center"/>
             <w:tcMar>
               <w:top w:w="90" w:type="dxa"/>
               <w:start w:w="100" w:type="dxa"/>
               <w:bottom w:w="90" w:type="dxa"/>
               <w:end w:w="100" w:type="dxa"/>
             </w:tcMar>
-            <w:shd w:fill="F2F5EF"/>
+            <w:shd w:fill="F7F6F1"/>
           </w:tcPr>
           <w:p>
             <w:pPr>
@@ -603,8 +378,8 @@
             </w:pPr>
             <w:r>
               <w:rPr>
-                <w:rFonts w:ascii="Arial" w:hAnsi="Arial"/>
-                <w:color w:val="17251F"/>
+                <w:rFonts w:ascii="Aptos" w:hAnsi="Aptos"/>
+                <w:color w:val="1F2B22"/>
                 <w:sz w:val="14"/>
               </w:rPr>
               <w:t>Non-Functional Requirements</w:t>
@@ -613,15 +388,15 @@
         </w:tc>
         <w:tc>
           <w:tcPr>
-            <w:tcW w:type="dxa" w:w="1800"/>
-            <w:vAlign w:val="top"/>
+            <w:tcW w:type="dxa" w:w="1584"/>
+            <w:vAlign w:val="center"/>
             <w:tcMar>
               <w:top w:w="90" w:type="dxa"/>
               <w:start w:w="100" w:type="dxa"/>
               <w:bottom w:w="90" w:type="dxa"/>
               <w:end w:w="100" w:type="dxa"/>
             </w:tcMar>
-            <w:shd w:fill="F2F5EF"/>
+            <w:shd w:fill="F7F6F1"/>
           </w:tcPr>
           <w:p>
             <w:pPr>
@@ -629,25 +404,25 @@
             </w:pPr>
             <w:r>
               <w:rPr>
-                <w:rFonts w:ascii="Arial" w:hAnsi="Arial"/>
-                <w:color w:val="17251F"/>
+                <w:rFonts w:ascii="Aptos" w:hAnsi="Aptos"/>
+                <w:color w:val="1F2B22"/>
                 <w:sz w:val="14"/>
               </w:rPr>
-              <w:t>Completed draft</w:t>
+              <w:t>Completed (Draft)</w:t>
             </w:r>
           </w:p>
         </w:tc>
         <w:tc>
           <w:tcPr>
-            <w:tcW w:type="dxa" w:w="5832"/>
-            <w:vAlign w:val="top"/>
+            <w:tcW w:type="dxa" w:w="5400"/>
+            <w:vAlign w:val="center"/>
             <w:tcMar>
               <w:top w:w="90" w:type="dxa"/>
               <w:start w:w="100" w:type="dxa"/>
               <w:bottom w:w="90" w:type="dxa"/>
               <w:end w:w="100" w:type="dxa"/>
             </w:tcMar>
-            <w:shd w:fill="F2F5EF"/>
+            <w:shd w:fill="F7F6F1"/>
           </w:tcPr>
           <w:p>
             <w:pPr>
@@ -655,23 +430,20 @@
             </w:pPr>
             <w:r>
               <w:rPr>
-                <w:rFonts w:ascii="Arial" w:hAnsi="Arial"/>
-                <w:color w:val="17251F"/>
+                <w:rFonts w:ascii="Aptos" w:hAnsi="Aptos"/>
+                <w:color w:val="1F2B22"/>
                 <w:sz w:val="14"/>
               </w:rPr>
-              <w:t>Security, privacy, usability, performance, data integrity and recoverability are documented.</w:t>
+              <w:t>Usability, privacy, access control, and booking integrity requirements are documented.</w:t>
             </w:r>
           </w:p>
         </w:tc>
       </w:tr>
       <w:tr>
-        <w:trPr>
-          <w:cantSplit/>
-        </w:trPr>
         <w:tc>
           <w:tcPr>
-            <w:tcW w:type="dxa" w:w="2160"/>
-            <w:vAlign w:val="top"/>
+            <w:tcW w:type="dxa" w:w="2232"/>
+            <w:vAlign w:val="center"/>
             <w:tcMar>
               <w:top w:w="90" w:type="dxa"/>
               <w:start w:w="100" w:type="dxa"/>
@@ -685,8 +457,8 @@
             </w:pPr>
             <w:r>
               <w:rPr>
-                <w:rFonts w:ascii="Arial" w:hAnsi="Arial"/>
-                <w:color w:val="17251F"/>
+                <w:rFonts w:ascii="Aptos" w:hAnsi="Aptos"/>
+                <w:color w:val="1F2B22"/>
                 <w:sz w:val="14"/>
               </w:rPr>
               <w:t>Software / System Design</w:t>
@@ -695,8 +467,8 @@
         </w:tc>
         <w:tc>
           <w:tcPr>
-            <w:tcW w:type="dxa" w:w="1800"/>
-            <w:vAlign w:val="top"/>
+            <w:tcW w:type="dxa" w:w="1584"/>
+            <w:vAlign w:val="center"/>
             <w:tcMar>
               <w:top w:w="90" w:type="dxa"/>
               <w:start w:w="100" w:type="dxa"/>
@@ -710,18 +482,18 @@
             </w:pPr>
             <w:r>
               <w:rPr>
-                <w:rFonts w:ascii="Arial" w:hAnsi="Arial"/>
-                <w:color w:val="17251F"/>
+                <w:rFonts w:ascii="Aptos" w:hAnsi="Aptos"/>
+                <w:color w:val="1F2B22"/>
                 <w:sz w:val="14"/>
               </w:rPr>
-              <w:t>Completed draft</w:t>
+              <w:t>Completed (Draft)</w:t>
             </w:r>
           </w:p>
         </w:tc>
         <w:tc>
           <w:tcPr>
-            <w:tcW w:type="dxa" w:w="5832"/>
-            <w:vAlign w:val="top"/>
+            <w:tcW w:type="dxa" w:w="5400"/>
+            <w:vAlign w:val="center"/>
             <w:tcMar>
               <w:top w:w="90" w:type="dxa"/>
               <w:start w:w="100" w:type="dxa"/>
@@ -735,30 +507,27 @@
             </w:pPr>
             <w:r>
               <w:rPr>
-                <w:rFonts w:ascii="Arial" w:hAnsi="Arial"/>
-                <w:color w:val="17251F"/>
+                <w:rFonts w:ascii="Aptos" w:hAnsi="Aptos"/>
+                <w:color w:val="1F2B22"/>
                 <w:sz w:val="14"/>
               </w:rPr>
-              <w:t>Engineering flowchart with actual diamonds, role-access flow and use-case diagram are included.</w:t>
+              <w:t>Booking flowchart, role flowchart, and use-case diagram are prepared for review.</w:t>
             </w:r>
           </w:p>
         </w:tc>
       </w:tr>
       <w:tr>
-        <w:trPr>
-          <w:cantSplit/>
-        </w:trPr>
         <w:tc>
           <w:tcPr>
-            <w:tcW w:type="dxa" w:w="2160"/>
-            <w:vAlign w:val="top"/>
+            <w:tcW w:type="dxa" w:w="2232"/>
+            <w:vAlign w:val="center"/>
             <w:tcMar>
               <w:top w:w="90" w:type="dxa"/>
               <w:start w:w="100" w:type="dxa"/>
               <w:bottom w:w="90" w:type="dxa"/>
               <w:end w:w="100" w:type="dxa"/>
             </w:tcMar>
-            <w:shd w:fill="F2F5EF"/>
+            <w:shd w:fill="F7F6F1"/>
           </w:tcPr>
           <w:p>
             <w:pPr>
@@ -766,8 +535,8 @@
             </w:pPr>
             <w:r>
               <w:rPr>
-                <w:rFonts w:ascii="Arial" w:hAnsi="Arial"/>
-                <w:color w:val="17251F"/>
+                <w:rFonts w:ascii="Aptos" w:hAnsi="Aptos"/>
+                <w:color w:val="1F2B22"/>
                 <w:sz w:val="14"/>
               </w:rPr>
               <w:t>UI/UX / Prototype</w:t>
@@ -776,15 +545,15 @@
         </w:tc>
         <w:tc>
           <w:tcPr>
-            <w:tcW w:type="dxa" w:w="1800"/>
-            <w:vAlign w:val="top"/>
+            <w:tcW w:type="dxa" w:w="1584"/>
+            <w:vAlign w:val="center"/>
             <w:tcMar>
               <w:top w:w="90" w:type="dxa"/>
               <w:start w:w="100" w:type="dxa"/>
               <w:bottom w:w="90" w:type="dxa"/>
               <w:end w:w="100" w:type="dxa"/>
             </w:tcMar>
-            <w:shd w:fill="F2F5EF"/>
+            <w:shd w:fill="F7F6F1"/>
           </w:tcPr>
           <w:p>
             <w:pPr>
@@ -792,25 +561,25 @@
             </w:pPr>
             <w:r>
               <w:rPr>
-                <w:rFonts w:ascii="Arial" w:hAnsi="Arial"/>
-                <w:color w:val="17251F"/>
+                <w:rFonts w:ascii="Aptos" w:hAnsi="Aptos"/>
+                <w:color w:val="1F2B22"/>
                 <w:sz w:val="14"/>
               </w:rPr>
-              <w:t>Completed prototype</w:t>
+              <w:t>In Progress</w:t>
             </w:r>
           </w:p>
         </w:tc>
         <w:tc>
           <w:tcPr>
-            <w:tcW w:type="dxa" w:w="5832"/>
-            <w:vAlign w:val="top"/>
+            <w:tcW w:type="dxa" w:w="5400"/>
+            <w:vAlign w:val="center"/>
             <w:tcMar>
               <w:top w:w="90" w:type="dxa"/>
               <w:start w:w="100" w:type="dxa"/>
               <w:bottom w:w="90" w:type="dxa"/>
               <w:end w:w="100" w:type="dxa"/>
             </w:tcMar>
-            <w:shd w:fill="F2F5EF"/>
+            <w:shd w:fill="F7F6F1"/>
           </w:tcPr>
           <w:p>
             <w:pPr>
@@ -818,23 +587,20 @@
             </w:pPr>
             <w:r>
               <w:rPr>
-                <w:rFonts w:ascii="Arial" w:hAnsi="Arial"/>
-                <w:color w:val="17251F"/>
+                <w:rFonts w:ascii="Aptos" w:hAnsi="Aptos"/>
+                <w:color w:val="1F2B22"/>
                 <w:sz w:val="14"/>
               </w:rPr>
-              <w:t>Responsive website and role dashboards are implemented in the local demo.</w:t>
+              <w:t>Static frontend files are prepared. Check the pages on the actual laptop and phone sizes.</w:t>
             </w:r>
           </w:p>
         </w:tc>
       </w:tr>
       <w:tr>
-        <w:trPr>
-          <w:cantSplit/>
-        </w:trPr>
         <w:tc>
           <w:tcPr>
-            <w:tcW w:type="dxa" w:w="2160"/>
-            <w:vAlign w:val="top"/>
+            <w:tcW w:type="dxa" w:w="2232"/>
+            <w:vAlign w:val="center"/>
             <w:tcMar>
               <w:top w:w="90" w:type="dxa"/>
               <w:start w:w="100" w:type="dxa"/>
@@ -848,8 +614,8 @@
             </w:pPr>
             <w:r>
               <w:rPr>
-                <w:rFonts w:ascii="Arial" w:hAnsi="Arial"/>
-                <w:color w:val="17251F"/>
+                <w:rFonts w:ascii="Aptos" w:hAnsi="Aptos"/>
+                <w:color w:val="1F2B22"/>
                 <w:sz w:val="14"/>
               </w:rPr>
               <w:t>Database / Data Design</w:t>
@@ -858,8 +624,8 @@
         </w:tc>
         <w:tc>
           <w:tcPr>
-            <w:tcW w:type="dxa" w:w="1800"/>
-            <w:vAlign w:val="top"/>
+            <w:tcW w:type="dxa" w:w="1584"/>
+            <w:vAlign w:val="center"/>
             <w:tcMar>
               <w:top w:w="90" w:type="dxa"/>
               <w:start w:w="100" w:type="dxa"/>
@@ -873,18 +639,18 @@
             </w:pPr>
             <w:r>
               <w:rPr>
-                <w:rFonts w:ascii="Arial" w:hAnsi="Arial"/>
-                <w:color w:val="17251F"/>
+                <w:rFonts w:ascii="Aptos" w:hAnsi="Aptos"/>
+                <w:color w:val="1F2B22"/>
                 <w:sz w:val="14"/>
               </w:rPr>
-              <w:t>Completed draft</w:t>
+              <w:t>In Progress</w:t>
             </w:r>
           </w:p>
         </w:tc>
         <w:tc>
           <w:tcPr>
-            <w:tcW w:type="dxa" w:w="5832"/>
-            <w:vAlign w:val="top"/>
+            <w:tcW w:type="dxa" w:w="5400"/>
+            <w:vAlign w:val="center"/>
             <w:tcMar>
               <w:top w:w="90" w:type="dxa"/>
               <w:start w:w="100" w:type="dxa"/>
@@ -898,30 +664,27 @@
             </w:pPr>
             <w:r>
               <w:rPr>
-                <w:rFonts w:ascii="Arial" w:hAnsi="Arial"/>
-                <w:color w:val="17251F"/>
+                <w:rFonts w:ascii="Aptos" w:hAnsi="Aptos"/>
+                <w:color w:val="1F2B22"/>
                 <w:sz w:val="14"/>
               </w:rPr>
-              <w:t>SQLite tables, relationships, constraints and indexes are included.</w:t>
+              <w:t>Supabase schema is prepared, but it still needs to run in your own Supabase project.</w:t>
             </w:r>
           </w:p>
         </w:tc>
       </w:tr>
       <w:tr>
-        <w:trPr>
-          <w:cantSplit/>
-        </w:trPr>
         <w:tc>
           <w:tcPr>
-            <w:tcW w:type="dxa" w:w="2160"/>
-            <w:vAlign w:val="top"/>
+            <w:tcW w:type="dxa" w:w="2232"/>
+            <w:vAlign w:val="center"/>
             <w:tcMar>
               <w:top w:w="90" w:type="dxa"/>
               <w:start w:w="100" w:type="dxa"/>
               <w:bottom w:w="90" w:type="dxa"/>
               <w:end w:w="100" w:type="dxa"/>
             </w:tcMar>
-            <w:shd w:fill="F2F5EF"/>
+            <w:shd w:fill="F7F6F1"/>
           </w:tcPr>
           <w:p>
             <w:pPr>
@@ -929,8 +692,8 @@
             </w:pPr>
             <w:r>
               <w:rPr>
-                <w:rFonts w:ascii="Arial" w:hAnsi="Arial"/>
-                <w:color w:val="17251F"/>
+                <w:rFonts w:ascii="Aptos" w:hAnsi="Aptos"/>
+                <w:color w:val="1F2B22"/>
                 <w:sz w:val="14"/>
               </w:rPr>
               <w:t>Development / Coding</w:t>
@@ -939,15 +702,15 @@
         </w:tc>
         <w:tc>
           <w:tcPr>
-            <w:tcW w:type="dxa" w:w="1800"/>
-            <w:vAlign w:val="top"/>
+            <w:tcW w:type="dxa" w:w="1584"/>
+            <w:vAlign w:val="center"/>
             <w:tcMar>
               <w:top w:w="90" w:type="dxa"/>
               <w:start w:w="100" w:type="dxa"/>
               <w:bottom w:w="90" w:type="dxa"/>
               <w:end w:w="100" w:type="dxa"/>
             </w:tcMar>
-            <w:shd w:fill="F2F5EF"/>
+            <w:shd w:fill="F7F6F1"/>
           </w:tcPr>
           <w:p>
             <w:pPr>
@@ -955,8 +718,8 @@
             </w:pPr>
             <w:r>
               <w:rPr>
-                <w:rFonts w:ascii="Arial" w:hAnsi="Arial"/>
-                <w:color w:val="17251F"/>
+                <w:rFonts w:ascii="Aptos" w:hAnsi="Aptos"/>
+                <w:color w:val="1F2B22"/>
                 <w:sz w:val="14"/>
               </w:rPr>
               <w:t>In Progress</w:t>
@@ -965,15 +728,15 @@
         </w:tc>
         <w:tc>
           <w:tcPr>
-            <w:tcW w:type="dxa" w:w="5832"/>
-            <w:vAlign w:val="top"/>
+            <w:tcW w:type="dxa" w:w="5400"/>
+            <w:vAlign w:val="center"/>
             <w:tcMar>
               <w:top w:w="90" w:type="dxa"/>
               <w:start w:w="100" w:type="dxa"/>
               <w:bottom w:w="90" w:type="dxa"/>
               <w:end w:w="100" w:type="dxa"/>
             </w:tcMar>
-            <w:shd w:fill="F2F5EF"/>
+            <w:shd w:fill="F7F6F1"/>
           </w:tcPr>
           <w:p>
             <w:pPr>
@@ -981,23 +744,20 @@
             </w:pPr>
             <w:r>
               <w:rPr>
-                <w:rFonts w:ascii="Arial" w:hAnsi="Arial"/>
-                <w:color w:val="17251F"/>
+                <w:rFonts w:ascii="Aptos" w:hAnsi="Aptos"/>
+                <w:color w:val="1F2B22"/>
                 <w:sz w:val="14"/>
               </w:rPr>
-              <w:t>Core features run locally; this is not production deployment.</w:t>
+              <w:t>HTML, CSS, JavaScript, and database functions are drafted. Connect the Supabase keys and finish integration.</w:t>
             </w:r>
           </w:p>
         </w:tc>
       </w:tr>
       <w:tr>
-        <w:trPr>
-          <w:cantSplit/>
-        </w:trPr>
         <w:tc>
           <w:tcPr>
-            <w:tcW w:type="dxa" w:w="2160"/>
-            <w:vAlign w:val="top"/>
+            <w:tcW w:type="dxa" w:w="2232"/>
+            <w:vAlign w:val="center"/>
             <w:tcMar>
               <w:top w:w="90" w:type="dxa"/>
               <w:start w:w="100" w:type="dxa"/>
@@ -1011,8 +771,8 @@
             </w:pPr>
             <w:r>
               <w:rPr>
-                <w:rFonts w:ascii="Arial" w:hAnsi="Arial"/>
-                <w:color w:val="17251F"/>
+                <w:rFonts w:ascii="Aptos" w:hAnsi="Aptos"/>
+                <w:color w:val="1F2B22"/>
                 <w:sz w:val="14"/>
               </w:rPr>
               <w:t>Testing</w:t>
@@ -1021,8 +781,8 @@
         </w:tc>
         <w:tc>
           <w:tcPr>
-            <w:tcW w:type="dxa" w:w="1800"/>
-            <w:vAlign w:val="top"/>
+            <w:tcW w:type="dxa" w:w="1584"/>
+            <w:vAlign w:val="center"/>
             <w:tcMar>
               <w:top w:w="90" w:type="dxa"/>
               <w:start w:w="100" w:type="dxa"/>
@@ -1036,8 +796,8 @@
             </w:pPr>
             <w:r>
               <w:rPr>
-                <w:rFonts w:ascii="Arial" w:hAnsi="Arial"/>
-                <w:color w:val="17251F"/>
+                <w:rFonts w:ascii="Aptos" w:hAnsi="Aptos"/>
+                <w:color w:val="1F2B22"/>
                 <w:sz w:val="14"/>
               </w:rPr>
               <w:t>In Progress</w:t>
@@ -1046,8 +806,8 @@
         </w:tc>
         <w:tc>
           <w:tcPr>
-            <w:tcW w:type="dxa" w:w="5832"/>
-            <w:vAlign w:val="top"/>
+            <w:tcW w:type="dxa" w:w="5400"/>
+            <w:vAlign w:val="center"/>
             <w:tcMar>
               <w:top w:w="90" w:type="dxa"/>
               <w:start w:w="100" w:type="dxa"/>
@@ -1061,30 +821,27 @@
             </w:pPr>
             <w:r>
               <w:rPr>
-                <w:rFonts w:ascii="Arial" w:hAnsi="Arial"/>
-                <w:color w:val="17251F"/>
+                <w:rFonts w:ascii="Aptos" w:hAnsi="Aptos"/>
+                <w:color w:val="1F2B22"/>
                 <w:sz w:val="14"/>
               </w:rPr>
-              <w:t>Selected API smoke tests passed; full UI, stakeholder and security tests are not finished.</w:t>
+              <w:t>Static checks can be run locally. Live authentication, booking, and RLS tests remain.</w:t>
             </w:r>
           </w:p>
         </w:tc>
       </w:tr>
       <w:tr>
-        <w:trPr>
-          <w:cantSplit/>
-        </w:trPr>
         <w:tc>
           <w:tcPr>
-            <w:tcW w:type="dxa" w:w="2160"/>
-            <w:vAlign w:val="top"/>
+            <w:tcW w:type="dxa" w:w="2232"/>
+            <w:vAlign w:val="center"/>
             <w:tcMar>
               <w:top w:w="90" w:type="dxa"/>
               <w:start w:w="100" w:type="dxa"/>
               <w:bottom w:w="90" w:type="dxa"/>
               <w:end w:w="100" w:type="dxa"/>
             </w:tcMar>
-            <w:shd w:fill="F2F5EF"/>
+            <w:shd w:fill="F7F6F1"/>
           </w:tcPr>
           <w:p>
             <w:pPr>
@@ -1092,8 +849,8 @@
             </w:pPr>
             <w:r>
               <w:rPr>
-                <w:rFonts w:ascii="Arial" w:hAnsi="Arial"/>
-                <w:color w:val="17251F"/>
+                <w:rFonts w:ascii="Aptos" w:hAnsi="Aptos"/>
+                <w:color w:val="1F2B22"/>
                 <w:sz w:val="14"/>
               </w:rPr>
               <w:t>Documentation</w:t>
@@ -1102,15 +859,15 @@
         </w:tc>
         <w:tc>
           <w:tcPr>
-            <w:tcW w:type="dxa" w:w="1800"/>
-            <w:vAlign w:val="top"/>
+            <w:tcW w:type="dxa" w:w="1584"/>
+            <w:vAlign w:val="center"/>
             <w:tcMar>
               <w:top w:w="90" w:type="dxa"/>
               <w:start w:w="100" w:type="dxa"/>
               <w:bottom w:w="90" w:type="dxa"/>
               <w:end w:w="100" w:type="dxa"/>
             </w:tcMar>
-            <w:shd w:fill="F2F5EF"/>
+            <w:shd w:fill="F7F6F1"/>
           </w:tcPr>
           <w:p>
             <w:pPr>
@@ -1118,25 +875,25 @@
             </w:pPr>
             <w:r>
               <w:rPr>
-                <w:rFonts w:ascii="Arial" w:hAnsi="Arial"/>
-                <w:color w:val="17251F"/>
+                <w:rFonts w:ascii="Aptos" w:hAnsi="Aptos"/>
+                <w:color w:val="1F2B22"/>
                 <w:sz w:val="14"/>
               </w:rPr>
-              <w:t>Completed draft</w:t>
+              <w:t>In Progress</w:t>
             </w:r>
           </w:p>
         </w:tc>
         <w:tc>
           <w:tcPr>
-            <w:tcW w:type="dxa" w:w="5832"/>
-            <w:vAlign w:val="top"/>
+            <w:tcW w:type="dxa" w:w="5400"/>
+            <w:vAlign w:val="center"/>
             <w:tcMar>
               <w:top w:w="90" w:type="dxa"/>
               <w:start w:w="100" w:type="dxa"/>
               <w:bottom w:w="90" w:type="dxa"/>
               <w:end w:w="100" w:type="dxa"/>
             </w:tcMar>
-            <w:shd w:fill="F2F5EF"/>
+            <w:shd w:fill="F7F6F1"/>
           </w:tcPr>
           <w:p>
             <w:pPr>
@@ -1144,27 +901,24 @@
             </w:pPr>
             <w:r>
               <w:rPr>
-                <w:rFonts w:ascii="Arial" w:hAnsi="Arial"/>
-                <w:color w:val="17251F"/>
+                <w:rFonts w:ascii="Aptos" w:hAnsi="Aptos"/>
+                <w:color w:val="1F2B22"/>
                 <w:sz w:val="14"/>
               </w:rPr>
-              <w:t>The project documentation, test plan, README and presentation have been drafted.</w:t>
+              <w:t>SRS, flowcharts, report, setup guide, and presentation are prepared. Check them against your real project state.</w:t>
             </w:r>
           </w:p>
         </w:tc>
       </w:tr>
     </w:tbl>
     <w:p>
-      <w:r>
-        <w:rPr>
-          <w:i w:val="0"/>
-        </w:rPr>
-      </w:r>
+      <w:pPr>
+        <w:spacing w:after="0"/>
+      </w:pPr>
     </w:p>
     <w:p>
       <w:pPr>
         <w:pStyle w:val="Heading2"/>
-        <w:keepNext/>
       </w:pPr>
       <w:r>
         <w:t>Overall project completion</w:t>
@@ -1173,15 +927,17 @@
     <w:p>
       <w:r>
         <w:rPr>
-          <w:i w:val="0"/>
+          <w:b/>
         </w:rPr>
-        <w:t>Proposed artifact-package estimate: approximately 65%. This estimate reflects that requirements drafts, diagrams, a local prototype, schema, initial smoke tests and documentation are available. It is not a verified measure of every group member’s work or of production readiness. Adjust this number to match actual group progress and instructor expectations.</w:t>
+        <w:t xml:space="preserve">Estimated completion: 35% (working estimate). </w:t>
+      </w:r>
+      <w:r>
+        <w:t>The requirements, diagrams, first frontend, and initial database schema are prepared. The percentage stays below half because the Supabase project has not yet been connected and verified, the public deployment has not been confirmed, and several end-to-end tests still need to be completed.</w:t>
       </w:r>
     </w:p>
     <w:p>
       <w:pPr>
         <w:pStyle w:val="Heading2"/>
-        <w:keepNext/>
       </w:pPr>
       <w:r>
         <w:t>Current group challenges</w:t>
@@ -1189,24 +945,17 @@
     </w:p>
     <w:p>
       <w:r>
-        <w:rPr>
-          <w:i w:val="0"/>
-        </w:rPr>
-        <w:t>The main challenge is confirming the assumptions that still affect the system, particularly real opening hours, cancellation and rescheduling rules, whether bookings require staff approval, and how barber compensation is calculated. The group also needs to perform broader UI and role-permission testing and make sure the submitted documents match the final implementation.</w:t>
+        <w:t>The main challenge is connecting the new static website to a real Supabase project and checking that the account roles match the database policies. The team also needs to confirm opening hours, service prices, barber information, and pay rules instead of leaving sample values in place. Until those details are checked, the homepage can be previewed but the live booking workflow should not be described as finished.</w:t>
       </w:r>
     </w:p>
     <w:p>
       <w:r>
-        <w:rPr>
-          <w:i w:val="0"/>
-        </w:rPr>
-        <w:t>Our plan is to review the requirements together, collect instructor or stakeholder feedback, assign each remaining feature and test to a member, and keep a record of issues and evidence. We will update the flowchart, prototype and documentation together so that they do not describe different versions of the system.</w:t>
+        <w:t>Our plan is to run the SQL setup, configure the public Supabase key in js/config.js, publish the files from the repository root, and test one account for each role. We will fix any failed permission or booking tests before sharing the link with other people.</w:t>
       </w:r>
     </w:p>
     <w:p>
       <w:pPr>
         <w:pStyle w:val="Heading2"/>
-        <w:keepNext/>
       </w:pPr>
       <w:r>
         <w:t>Next three major tasks</w:t>
@@ -1218,7 +967,7 @@
         <w:spacing w:after="40"/>
       </w:pPr>
       <w:r>
-        <w:t>Validate the requirements and business rules with group members, instructor, and a stakeholder if accessible.</w:t>
+        <w:t>Create the Supabase project and run supabase/schema.sql; check that tables and functions are created without errors.</w:t>
       </w:r>
     </w:p>
     <w:p>
@@ -1227,7 +976,7 @@
         <w:spacing w:after="40"/>
       </w:pPr>
       <w:r>
-        <w:t>Run the local demo and execute the test plan for customer, admin, barber and owner roles; fix the issues that are found.</w:t>
+        <w:t>Put the static site files at the GitHub repository root, add the Supabase URL and public key, and publish through GitHub Pages.</w:t>
       </w:r>
     </w:p>
     <w:p>
@@ -1236,22 +985,25 @@
         <w:spacing w:after="40"/>
       </w:pPr>
       <w:r>
-        <w:t>Finalize the diagrams and documentation, collect verifiable evidence, and prepare the project presentation.</w:t>
+        <w:t>Test registration, booking conflicts, customer privacy, Admin schedule changes, Barber earnings, Owner controls, and review approval; record the real results.</w:t>
       </w:r>
     </w:p>
     <w:p>
       <w:pPr>
         <w:pStyle w:val="Heading1"/>
-        <w:keepNext/>
       </w:pPr>
       <w:r>
-        <w:t>Part C — Individual contribution</w:t>
+        <w:t>PART C — INDIVIDUAL CONTRIBUTION</w:t>
+      </w:r>
+    </w:p>
+    <w:p>
+      <w:r>
+        <w:t>Use this section as a draft only. Keep the parts that describe your own work and change anything that does not match what you personally did.</w:t>
       </w:r>
     </w:p>
     <w:p>
       <w:pPr>
         <w:pStyle w:val="Heading2"/>
-        <w:keepNext/>
       </w:pPr>
       <w:r>
         <w:t>1. What have you personally contributed?</w:t>
@@ -1259,16 +1011,12 @@
     </w:p>
     <w:p>
       <w:r>
-        <w:rPr>
-          <w:i w:val="0"/>
-        </w:rPr>
-        <w:t>Draft answer to edit for accuracy: I contributed to planning and designing our Barbershop Booking Management System. I organized the booking workflow, defined the proposed permissions and dashboards for customers, admins, barbers and the owner, and prepared the system-flow diagrams and requirements structure. I also assembled the local prototype and documentation artifacts so the group can review the design against the requirements.</w:t>
+        <w:t>I helped plan the Barbershop Booking Management System and organize what each user role should be able to do. I worked through the booking process from the homepage to choosing a service, barber, date, and time, and helped define the separate areas for customers, Admins, barbers, and the owner. I also reviewed the flowcharts and the move toward a simpler HTML, CSS, and JavaScript frontend with Supabase for shared accounts and bookings.</w:t>
       </w:r>
     </w:p>
     <w:p>
       <w:pPr>
         <w:pStyle w:val="Heading2"/>
-        <w:keepNext/>
       </w:pPr>
       <w:r>
         <w:t>2. Evidence of your contribution</w:t>
@@ -1276,16 +1024,66 @@
     </w:p>
     <w:p>
       <w:r>
+        <w:t>Evidence: the engineering flowchart and role-access diagram in the project diagrams folder. They show the steps of booking, the decision points, and how a signed-in user is sent to the correct dashboard. Add a screenshot of the actual files, code, or GitHub commit you worked on before submitting.</w:t>
+      </w:r>
+    </w:p>
+    <w:p>
+      <w:pPr>
+        <w:spacing w:after="0"/>
+        <w:jc w:val="center"/>
+      </w:pPr>
+      <w:r>
+        <w:drawing>
+          <wp:inline xmlns:a="http://schemas.openxmlformats.org/drawingml/2006/main" xmlns:pic="http://schemas.openxmlformats.org/drawingml/2006/picture">
+            <wp:extent cx="4754880" cy="3487886"/>
+            <wp:docPr id="1" name="Picture 1"/>
+            <wp:cNvGraphicFramePr>
+              <a:graphicFrameLocks noChangeAspect="1"/>
+            </wp:cNvGraphicFramePr>
+            <a:graphic>
+              <a:graphicData uri="http://schemas.openxmlformats.org/drawingml/2006/picture">
+                <pic:pic>
+                  <pic:nvPicPr>
+                    <pic:cNvPr id="0" name="role_access.png"/>
+                    <pic:cNvPicPr/>
+                  </pic:nvPicPr>
+                  <pic:blipFill>
+                    <a:blip r:embed="rId11"/>
+                    <a:stretch>
+                      <a:fillRect/>
+                    </a:stretch>
+                  </pic:blipFill>
+                  <pic:spPr>
+                    <a:xfrm>
+                      <a:off x="0" y="0"/>
+                      <a:ext cx="4754880" cy="3487886"/>
+                    </a:xfrm>
+                    <a:prstGeom prst="rect"/>
+                  </pic:spPr>
+                </pic:pic>
+              </a:graphicData>
+            </a:graphic>
+          </wp:inline>
+        </w:drawing>
+      </w:r>
+    </w:p>
+    <w:p>
+      <w:pPr>
+        <w:spacing w:before="40" w:after="100"/>
+        <w:jc w:val="center"/>
+      </w:pPr>
+      <w:r>
         <w:rPr>
-          <w:i w:val="0"/>
+          <w:i/>
+          <w:color w:val="687168"/>
+          <w:sz w:val="16"/>
         </w:rPr>
-        <w:t>Suggested evidence: include the booking engineering flowchart, the role-access flowchart, a screenshot of the homepage or one role dashboard, and (if you used version control) the relevant commit. Suggested caption: “This evidence shows the workflow and role permissions I prepared for the proposed Barbershop Booking Management System, including decision points for login, field validation and barber availability.”</w:t>
+        <w:t>Evidence caption: Role-access flowchart prepared for the project. It shows the separate login choices and the account-role check before each dashboard opens.</w:t>
       </w:r>
     </w:p>
     <w:p>
       <w:pPr>
         <w:pStyle w:val="Heading2"/>
-        <w:keepNext/>
       </w:pPr>
       <w:r>
         <w:t>3. What are you currently working on?</w:t>
@@ -1293,16 +1091,12 @@
     </w:p>
     <w:p>
       <w:r>
-        <w:rPr>
-          <w:i w:val="0"/>
-        </w:rPr>
-        <w:t>Draft answer: I am reviewing the functional requirements and role permissions and checking that the flowchart matches the local prototype. The remaining work is to confirm the assumptions with the group, finish end-to-end testing, and correct any mismatches between the documents and the actual interface.</w:t>
+        <w:t>I am working on getting the static website ready to connect with Supabase and be published from our GitHub repository. The page structure, CSS, JavaScript, SQL schema, and setup notes are prepared, but the website still needs our own Supabase URL and public key. The remaining work is to run the SQL, publish the files from the repository root, and test the live flow.</w:t>
       </w:r>
     </w:p>
     <w:p>
       <w:pPr>
         <w:pStyle w:val="Heading2"/>
-        <w:keepNext/>
       </w:pPr>
       <w:r>
         <w:t>4. What will you personally work on next?</w:t>
@@ -1310,16 +1104,12 @@
     </w:p>
     <w:p>
       <w:r>
-        <w:rPr>
-          <w:i w:val="0"/>
-        </w:rPr>
-        <w:t>Draft answer: I will run the prototype through the test cases for each role and record evidence of the booking, status-update, review and permission checks. I plan to finish this before the group’s final documentation review so that the report and presentation are based on verified behavior.</w:t>
+        <w:t>My next task is to configure Supabase and help test a full booking from a customer account. After that, I will check the Admin, Barber, and Owner dashboards and record screenshots of the results. I plan to finish these checks before our next progress review.</w:t>
       </w:r>
     </w:p>
     <w:p>
       <w:pPr>
         <w:pStyle w:val="Heading2"/>
-        <w:keepNext/>
       </w:pPr>
       <w:r>
         <w:t>5. Individual reflection (3–5 sentences)</w:t>
@@ -1327,85 +1117,32 @@
     </w:p>
     <w:p>
       <w:r>
-        <w:rPr>
-          <w:i w:val="0"/>
-        </w:rPr>
-        <w:t>I think our group needs to prioritize confirming the requirements and testing the main booking process. The system must prevent schedule conflicts and keep customer information, barber earnings and owner reports private. Completing the tests before the final presentation will help us find issues while there is still time to fix them. We should divide the remaining work clearly and update the documentation whenever the design changes.</w:t>
+        <w:t>I think we should prioritize the connection between the website and database before adding more features. The booking process must save the right information and stop two customers from taking the same barber’s time slot. We also need to check the permissions for every role, especially customer details and employee earnings. Once those tests pass, it will be easier to prepare the final screenshots and presentation.</w:t>
       </w:r>
     </w:p>
     <w:p>
       <w:pPr>
         <w:pStyle w:val="Heading1"/>
-        <w:keepNext/>
       </w:pPr>
       <w:r>
-        <w:t>Part D — Instructor assistance</w:t>
+        <w:t>PART D — INSTRUCTOR ASSISTANCE</w:t>
       </w:r>
     </w:p>
     <w:p>
       <w:r>
-        <w:rPr>
-          <w:i w:val="0"/>
-        </w:rPr>
-        <w:t>YES — proposed question for the instructor: “Is a locally working prototype with authentication, booking logic and a database sufficient for this project stage, or does the final submission require deployment or additional integrations? Are there specific required diagrams, testing evidence or documentation sections we should include?”</w:t>
+        <w:t>YES. Our group would like to confirm whether publishing the static HTML/CSS/JavaScript frontend with Supabase as the backend satisfies the project requirements. We would also appreciate guidance on how many live end-to-end test cases and how much evidence are expected for the final submission.</w:t>
       </w:r>
     </w:p>
-    <w:tbl>
-      <w:tblPr>
-        <w:tblW w:type="auto" w:w="0"/>
-        <w:jc w:val="center"/>
-        <w:tblLook w:firstColumn="1" w:firstRow="1" w:lastColumn="0" w:lastRow="0" w:noHBand="0" w:noVBand="1" w:val="04A0"/>
-      </w:tblPr>
-      <w:tblGrid>
-        <w:gridCol w:w="10166"/>
-      </w:tblGrid>
-      <w:tr>
-        <w:tc>
-          <w:tcPr>
-            <w:tcW w:type="dxa" w:w="10166"/>
-            <w:shd w:fill="FFF0C2"/>
-            <w:tcMar>
-              <w:top w:w="140" w:type="dxa"/>
-              <w:start w:w="180" w:type="dxa"/>
-              <w:bottom w:w="140" w:type="dxa"/>
-              <w:end w:w="180" w:type="dxa"/>
-            </w:tcMar>
-          </w:tcPr>
-          <w:p>
-            <w:pPr>
-              <w:spacing w:after="80"/>
-            </w:pPr>
-            <w:r>
-              <w:rPr>
-                <w:b/>
-                <w:color w:val="214F3C"/>
-              </w:rPr>
-              <w:t>Before submission</w:t>
-            </w:r>
-          </w:p>
-          <w:p>
-            <w:pPr>
-              <w:spacing w:after="0" w:line="252" w:lineRule="auto"/>
-            </w:pPr>
-            <w:r>
-              <w:t>This report is a draft. Update statuses, percentage, individual contribution and completion dates to reflect the real group situation. Do not claim interviews, implementation, testing or individual work that did not occur.</w:t>
-            </w:r>
-          </w:p>
-        </w:tc>
-      </w:tr>
-    </w:tbl>
     <w:p>
       <w:r>
-        <w:rPr>
-          <w:i w:val="0"/>
-        </w:rPr>
+        <w:t>Before submitting, replace the draft status and percentage if your real project progress is different. Add your own name, course details, group members, and the required evidence from your own GitHub activity or testing.</w:t>
       </w:r>
     </w:p>
     <w:sectPr>
       <w:headerReference w:type="default" r:id="rId9"/>
       <w:footerReference w:type="default" r:id="rId10"/>
       <w:pgSz w:w="12240" w:h="15840"/>
-      <w:pgMar w:top="979" w:right="1037" w:bottom="979" w:left="1037" w:header="461" w:footer="461" w:gutter="0"/>
+      <w:pgMar w:top="893" w:right="1008" w:bottom="893" w:left="1008" w:header="403" w:footer="403" w:gutter="0"/>
       <w:cols w:space="720"/>
       <w:docGrid w:linePitch="360"/>
     </w:sectPr>
@@ -1422,32 +1159,12 @@
     </w:pPr>
     <w:r>
       <w:rPr>
-        <w:color w:val="627067"/>
+        <w:color w:val="687168"/>
         <w:sz w:val="16"/>
       </w:rPr>
-      <w:t xml:space="preserve">Project working draft  •  </w:t>
+      <w:t xml:space="preserve">Barbershop Booking Management System  |  Project draft  |  </w:t>
     </w:r>
-    <w:r>
-      <w:fldChar w:fldCharType="begin"/>
-      <w:instrText xml:space="preserve">PAGE</w:instrText>
-      <w:fldChar w:fldCharType="separate"/>
-      <w:t>1</w:t>
-      <w:fldChar w:fldCharType="end"/>
-    </w:r>
-    <w:r>
-      <w:rPr>
-        <w:color w:val="627067"/>
-        <w:sz w:val="16"/>
-      </w:rPr>
-      <w:t xml:space="preserve"> / </w:t>
-    </w:r>
-    <w:r>
-      <w:fldChar w:fldCharType="begin"/>
-      <w:instrText xml:space="preserve">NUMPAGES</w:instrText>
-      <w:fldChar w:fldCharType="separate"/>
-      <w:t>1</w:t>
-      <w:fldChar w:fldCharType="end"/>
-    </w:r>
+    <w:fldSimple w:instr="PAGE"/>
   </w:p>
 </w:ftr>
 </file>
@@ -1456,17 +1173,16 @@
 <w:hdr xmlns:m="http://schemas.openxmlformats.org/officeDocument/2006/math" xmlns:mc="http://schemas.openxmlformats.org/markup-compatibility/2006" xmlns:mo="http://schemas.microsoft.com/office/mac/office/2008/main" xmlns:mv="urn:schemas-microsoft-com:mac:vml" xmlns:o="urn:schemas-microsoft-com:office:office" xmlns:r="http://schemas.openxmlformats.org/officeDocument/2006/relationships" xmlns:v="urn:schemas-microsoft-com:vml" xmlns:w10="urn:schemas-microsoft-com:office:word" xmlns:w14="http://schemas.microsoft.com/office/word/2010/wordml" xmlns:w="http://schemas.openxmlformats.org/wordprocessingml/2006/main" xmlns:wne="http://schemas.microsoft.com/office/word/2006/wordml" xmlns:wp14="http://schemas.microsoft.com/office/word/2010/wordprocessingDrawing" xmlns:wp="http://schemas.openxmlformats.org/drawingml/2006/wordprocessingDrawing" xmlns:wpc="http://schemas.microsoft.com/office/word/2010/wordprocessingCanvas" xmlns:wpg="http://schemas.microsoft.com/office/word/2010/wordprocessingGroup" xmlns:wpi="http://schemas.microsoft.com/office/word/2010/wordprocessingInk" xmlns:wps="http://schemas.microsoft.com/office/word/2010/wordprocessingShape" mc:Ignorable="w14 wp14">
   <w:p>
     <w:pPr>
-      <w:pStyle w:val="Header"/>
+      <w:pStyle w:val="Caption"/>
       <w:jc w:val="right"/>
     </w:pPr>
     <w:r>
       <w:rPr>
-        <w:rFonts w:ascii="Arial" w:hAnsi="Arial"/>
-        <w:b/>
-        <w:color w:val="2F6E52"/>
-        <w:sz w:val="15"/>
-      </w:rPr>
-      <w:t>BARBERSHOP BOOKING MANAGEMENT SYSTEM</w:t>
+        <w:rFonts w:ascii="Aptos" w:hAnsi="Aptos"/>
+        <w:color w:val="687168"/>
+        <w:sz w:val="16"/>
+      </w:rPr>
+      <w:t>PROJECT PROGRESS REPORT</w:t>
     </w:r>
   </w:p>
 </w:hdr>
@@ -1836,12 +1552,12 @@
     <w:qFormat/>
     <w:rsid w:val="00FC693F"/>
     <w:pPr>
-      <w:spacing w:after="100" w:line="269" w:lineRule="auto"/>
+      <w:spacing w:after="100" w:line="259" w:lineRule="auto"/>
     </w:pPr>
     <w:rPr>
-      <w:rFonts w:ascii="Arial" w:hAnsi="Arial"/>
-      <w:color w:val="17251F"/>
-      <w:sz w:val="18"/>
+      <w:rFonts w:ascii="Aptos" w:hAnsi="Aptos"/>
+      <w:color w:val="1F2B22"/>
+      <w:sz w:val="19"/>
     </w:rPr>
   </w:style>
   <w:style w:type="paragraph" w:styleId="Header">
@@ -1903,11 +1619,11 @@
       <w:outlineLvl w:val="0"/>
     </w:pPr>
     <w:rPr>
-      <w:rFonts w:asciiTheme="majorHAnsi" w:eastAsiaTheme="majorEastAsia" w:hAnsiTheme="majorHAnsi" w:cstheme="majorBidi" w:ascii="Arial" w:hAnsi="Arial"/>
+      <w:rFonts w:asciiTheme="majorHAnsi" w:eastAsiaTheme="majorEastAsia" w:hAnsiTheme="majorHAnsi" w:cstheme="majorBidi" w:ascii="Aptos Display" w:hAnsi="Aptos Display"/>
       <w:b/>
       <w:bCs/>
-      <w:color w:val="214F3C"/>
-      <w:sz w:val="40"/>
+      <w:color w:val="50634F"/>
+      <w:sz w:val="38"/>
       <w:szCs w:val="28"/>
     </w:rPr>
   </w:style>
@@ -1927,11 +1643,11 @@
       <w:outlineLvl w:val="1"/>
     </w:pPr>
     <w:rPr>
-      <w:rFonts w:asciiTheme="majorHAnsi" w:eastAsiaTheme="majorEastAsia" w:hAnsiTheme="majorHAnsi" w:cstheme="majorBidi" w:ascii="Arial" w:hAnsi="Arial"/>
+      <w:rFonts w:asciiTheme="majorHAnsi" w:eastAsiaTheme="majorEastAsia" w:hAnsiTheme="majorHAnsi" w:cstheme="majorBidi" w:ascii="Aptos Display" w:hAnsi="Aptos Display"/>
       <w:b/>
       <w:bCs/>
-      <w:color w:val="2F6E52"/>
-      <w:sz w:val="28"/>
+      <w:color w:val="1F2B22"/>
+      <w:sz w:val="26"/>
       <w:szCs w:val="26"/>
     </w:rPr>
   </w:style>
@@ -1951,11 +1667,11 @@
       <w:outlineLvl w:val="2"/>
     </w:pPr>
     <w:rPr>
-      <w:rFonts w:asciiTheme="majorHAnsi" w:eastAsiaTheme="majorEastAsia" w:hAnsiTheme="majorHAnsi" w:cstheme="majorBidi" w:ascii="Arial" w:hAnsi="Arial"/>
+      <w:rFonts w:asciiTheme="majorHAnsi" w:eastAsiaTheme="majorEastAsia" w:hAnsiTheme="majorHAnsi" w:cstheme="majorBidi" w:ascii="Aptos Display" w:hAnsi="Aptos Display"/>
       <w:b/>
       <w:bCs/>
-      <w:color w:val="17251F"/>
-      <w:sz w:val="22"/>
+      <w:color w:val="B8893D"/>
+      <w:sz w:val="20"/>
     </w:rPr>
   </w:style>
   <w:style w:type="paragraph" w:styleId="Heading4">
@@ -2194,12 +1910,12 @@
       <w:contextualSpacing/>
     </w:pPr>
     <w:rPr>
-      <w:rFonts w:asciiTheme="majorHAnsi" w:eastAsiaTheme="majorEastAsia" w:hAnsiTheme="majorHAnsi" w:cstheme="majorBidi" w:ascii="Arial" w:hAnsi="Arial"/>
+      <w:rFonts w:asciiTheme="majorHAnsi" w:eastAsiaTheme="majorEastAsia" w:hAnsiTheme="majorHAnsi" w:cstheme="majorBidi" w:ascii="Aptos Display" w:hAnsi="Aptos Display"/>
       <w:b/>
-      <w:color w:val="214F3C"/>
+      <w:color w:val="1F2B22"/>
       <w:spacing w:val="5"/>
       <w:kern w:val="28"/>
-      <w:sz w:val="64"/>
+      <w:sz w:val="60"/>
       <w:szCs w:val="52"/>
     </w:rPr>
   </w:style>
@@ -2227,20 +1943,17 @@
     <w:qFormat/>
     <w:rsid w:val="00FC693F"/>
     <w:pPr>
-      <w:keepNext/>
       <w:numPr>
         <w:ilvl w:val="1"/>
       </w:numPr>
-      <w:spacing w:before="200" w:after="100"/>
     </w:pPr>
     <w:rPr>
-      <w:rFonts w:asciiTheme="majorHAnsi" w:eastAsiaTheme="majorEastAsia" w:hAnsiTheme="majorHAnsi" w:cstheme="majorBidi" w:ascii="Arial" w:hAnsi="Arial"/>
-      <w:b w:val="0"/>
+      <w:rFonts w:asciiTheme="majorHAnsi" w:eastAsiaTheme="majorEastAsia" w:hAnsiTheme="majorHAnsi" w:cstheme="majorBidi"/>
       <w:i/>
       <w:iCs/>
-      <w:color w:val="627067"/>
+      <w:color w:val="4F81BD" w:themeColor="accent1"/>
       <w:spacing w:val="15"/>
-      <w:sz w:val="28"/>
+      <w:sz w:val="24"/>
       <w:szCs w:val="24"/>
     </w:rPr>
   </w:style>

</xml_diff>